<commit_message>
Teknik doküman: kırık link denetiminde # parçası atılmıyor (düzeltme)
Co-Authored-By: Claude Opus 5.5 <noreply@anthropic.com>
Claude-Session: https://claude.ai/code/session_01Y7HA7zWrzagZQyqvydG6xL
</commit_message>
<xml_diff>
--- a/docs/TEKNIK_DOKUMAN.docx
+++ b/docs/TEKNIK_DOKUMAN.docx
@@ -8661,7 +8661,7 @@
         <w:spacing w:after="60"/>
       </w:pPr>
       <w:r>
-        <w:t xml:space="preserve">Bağlantılar tekilleştirilir. Adresin </w:t>
+        <w:t xml:space="preserve">Bağlantılar tam adreslerine göre tekilleştirilir. Adresin </w:t>
       </w:r>
       <w:r>
         <w:rPr>
@@ -8672,7 +8672,18 @@
         <w:t xml:space="preserve">#…</w:t>
       </w:r>
       <w:r>
-        <w:t xml:space="preserve"> parçası sunucuya gitmediği için aynı adresin farklı parçaları tek bağlantı sayılır.</w:t>
+        <w:t xml:space="preserve"> parçası atılmaz: aynı sayfanın farklı </w:t>
+      </w:r>
+      <w:r>
+        <w:rPr>
+          <w:rFonts w:ascii="Courier New" w:cs="Courier New" w:eastAsia="Courier New" w:hAnsi="Courier New"/>
+          <w:sz w:val="18"/>
+          <w:szCs w:val="18"/>
+        </w:rPr>
+        <w:t xml:space="preserve">#</w:t>
+      </w:r>
+      <w:r>
+        <w:t xml:space="preserve"> parçaları ayrı bağlantı sayılır ve ayrı denenir (sunucuya giden istek aynı olduğu için sonuçları da aynıdır).</w:t>
       </w:r>
     </w:p>
     <w:p>

</xml_diff>